<commit_message>
remove nested git repository and convert to single repo
</commit_message>
<xml_diff>
--- a/数学刷题系统使用说明书.docx
+++ b/数学刷题系统使用说明书.docx
@@ -15,6 +15,8 @@
         </w:rPr>
       </w:pPr>
       <w:bookmarkStart w:id="0" w:name="_Toc28745"/>
+      <w:bookmarkStart w:id="59" w:name="_GoBack"/>
+      <w:bookmarkEnd w:id="59"/>
       <w:r>
         <w:rPr>
           <w:rFonts w:ascii="Arial" w:hAnsi="Arial" w:eastAsia="等线" w:cs="Arial"/>
@@ -1932,8 +1934,8 @@
           <w:sz w:val="32"/>
         </w:rPr>
       </w:pPr>
-      <w:bookmarkStart w:id="1" w:name="heading_1"/>
-      <w:bookmarkStart w:id="2" w:name="_Toc21021"/>
+      <w:bookmarkStart w:id="1" w:name="_Toc21021"/>
+      <w:bookmarkStart w:id="2" w:name="heading_1"/>
     </w:p>
     <w:p>
       <w:pPr>
@@ -1986,8 +1988,8 @@
         <w:jc w:val="left"/>
         <w:outlineLvl w:val="2"/>
       </w:pPr>
-      <w:bookmarkStart w:id="3" w:name="heading_2"/>
-      <w:bookmarkStart w:id="4" w:name="_Toc15401"/>
+      <w:bookmarkStart w:id="3" w:name="_Toc15401"/>
+      <w:bookmarkStart w:id="4" w:name="heading_2"/>
       <w:r>
         <w:rPr>
           <w:rFonts w:ascii="Arial" w:hAnsi="Arial" w:eastAsia="等线" w:cs="Arial"/>
@@ -2020,8 +2022,8 @@
         <w:jc w:val="left"/>
         <w:outlineLvl w:val="2"/>
       </w:pPr>
-      <w:bookmarkStart w:id="5" w:name="heading_3"/>
-      <w:bookmarkStart w:id="6" w:name="_Toc18465"/>
+      <w:bookmarkStart w:id="5" w:name="_Toc18465"/>
+      <w:bookmarkStart w:id="6" w:name="heading_3"/>
       <w:r>
         <w:rPr>
           <w:rFonts w:ascii="Arial" w:hAnsi="Arial" w:eastAsia="等线" w:cs="Arial"/>
@@ -2234,8 +2236,8 @@
         <w:jc w:val="left"/>
         <w:outlineLvl w:val="2"/>
       </w:pPr>
-      <w:bookmarkStart w:id="11" w:name="heading_6"/>
-      <w:bookmarkStart w:id="12" w:name="_Toc25203"/>
+      <w:bookmarkStart w:id="11" w:name="_Toc25203"/>
+      <w:bookmarkStart w:id="12" w:name="heading_6"/>
       <w:r>
         <w:rPr>
           <w:rFonts w:ascii="Arial" w:hAnsi="Arial" w:eastAsia="等线" w:cs="Arial"/>
@@ -2546,8 +2548,8 @@
         <w:jc w:val="left"/>
         <w:outlineLvl w:val="1"/>
       </w:pPr>
-      <w:bookmarkStart w:id="17" w:name="heading_9"/>
-      <w:bookmarkStart w:id="18" w:name="_Toc11000"/>
+      <w:bookmarkStart w:id="17" w:name="_Toc11000"/>
+      <w:bookmarkStart w:id="18" w:name="heading_9"/>
       <w:r>
         <w:rPr>
           <w:rFonts w:ascii="Arial" w:hAnsi="Arial" w:eastAsia="等线" w:cs="Arial"/>
@@ -2598,6 +2600,10 @@
         <w:spacing w:before="120" w:after="120" w:line="288" w:lineRule="auto"/>
         <w:ind w:left="0"/>
         <w:jc w:val="left"/>
+        <w:rPr>
+          <w:rFonts w:ascii="Arial" w:hAnsi="Arial" w:eastAsia="等线" w:cs="Arial"/>
+          <w:sz w:val="22"/>
+        </w:rPr>
       </w:pPr>
       <w:r>
         <w:rPr>
@@ -2612,6 +2618,60 @@
         <w:spacing w:before="120" w:after="120" w:line="288" w:lineRule="auto"/>
         <w:ind w:left="0"/>
         <w:jc w:val="left"/>
+        <w:rPr>
+          <w:rFonts w:ascii="Arial" w:hAnsi="Arial" w:eastAsia="等线" w:cs="Arial"/>
+          <w:sz w:val="22"/>
+        </w:rPr>
+      </w:pPr>
+      <w:r>
+        <w:drawing>
+          <wp:inline distT="0" distB="0" distL="114300" distR="114300">
+            <wp:extent cx="5268595" cy="2640330"/>
+            <wp:effectExtent l="0" t="0" r="4445" b="11430"/>
+            <wp:docPr id="7" name="图片 1"/>
+            <wp:cNvGraphicFramePr>
+              <a:graphicFrameLocks xmlns:a="http://schemas.openxmlformats.org/drawingml/2006/main" noChangeAspect="1"/>
+            </wp:cNvGraphicFramePr>
+            <a:graphic xmlns:a="http://schemas.openxmlformats.org/drawingml/2006/main">
+              <a:graphicData uri="http://schemas.openxmlformats.org/drawingml/2006/picture">
+                <pic:pic xmlns:pic="http://schemas.openxmlformats.org/drawingml/2006/picture">
+                  <pic:nvPicPr>
+                    <pic:cNvPr id="7" name="图片 1"/>
+                    <pic:cNvPicPr>
+                      <a:picLocks noChangeAspect="1"/>
+                    </pic:cNvPicPr>
+                  </pic:nvPicPr>
+                  <pic:blipFill>
+                    <a:blip r:embed="rId6"/>
+                    <a:stretch>
+                      <a:fillRect/>
+                    </a:stretch>
+                  </pic:blipFill>
+                  <pic:spPr>
+                    <a:xfrm>
+                      <a:off x="0" y="0"/>
+                      <a:ext cx="5268595" cy="2640330"/>
+                    </a:xfrm>
+                    <a:prstGeom prst="rect">
+                      <a:avLst/>
+                    </a:prstGeom>
+                    <a:noFill/>
+                    <a:ln>
+                      <a:noFill/>
+                    </a:ln>
+                  </pic:spPr>
+                </pic:pic>
+              </a:graphicData>
+            </a:graphic>
+          </wp:inline>
+        </w:drawing>
+      </w:r>
+    </w:p>
+    <w:p>
+      <w:pPr>
+        <w:spacing w:before="120" w:after="120" w:line="288" w:lineRule="auto"/>
+        <w:ind w:left="0"/>
+        <w:jc w:val="left"/>
       </w:pPr>
       <w:r>
         <w:rPr>
@@ -2682,6 +2742,10 @@
         <w:spacing w:before="120" w:after="120" w:line="288" w:lineRule="auto"/>
         <w:ind w:left="0"/>
         <w:jc w:val="left"/>
+        <w:rPr>
+          <w:rFonts w:ascii="Arial" w:hAnsi="Arial" w:eastAsia="等线" w:cs="Arial"/>
+          <w:sz w:val="22"/>
+        </w:rPr>
       </w:pPr>
       <w:r>
         <w:rPr>
@@ -2696,6 +2760,60 @@
         <w:spacing w:before="120" w:after="120" w:line="288" w:lineRule="auto"/>
         <w:ind w:left="0"/>
         <w:jc w:val="left"/>
+        <w:rPr>
+          <w:rFonts w:ascii="Arial" w:hAnsi="Arial" w:eastAsia="等线" w:cs="Arial"/>
+          <w:sz w:val="22"/>
+        </w:rPr>
+      </w:pPr>
+      <w:r>
+        <w:drawing>
+          <wp:inline distT="0" distB="0" distL="114300" distR="114300">
+            <wp:extent cx="5269865" cy="2551430"/>
+            <wp:effectExtent l="0" t="0" r="3175" b="8890"/>
+            <wp:docPr id="1" name="图片 1"/>
+            <wp:cNvGraphicFramePr>
+              <a:graphicFrameLocks xmlns:a="http://schemas.openxmlformats.org/drawingml/2006/main" noChangeAspect="1"/>
+            </wp:cNvGraphicFramePr>
+            <a:graphic xmlns:a="http://schemas.openxmlformats.org/drawingml/2006/main">
+              <a:graphicData uri="http://schemas.openxmlformats.org/drawingml/2006/picture">
+                <pic:pic xmlns:pic="http://schemas.openxmlformats.org/drawingml/2006/picture">
+                  <pic:nvPicPr>
+                    <pic:cNvPr id="1" name="图片 1"/>
+                    <pic:cNvPicPr>
+                      <a:picLocks noChangeAspect="1"/>
+                    </pic:cNvPicPr>
+                  </pic:nvPicPr>
+                  <pic:blipFill>
+                    <a:blip r:embed="rId7"/>
+                    <a:stretch>
+                      <a:fillRect/>
+                    </a:stretch>
+                  </pic:blipFill>
+                  <pic:spPr>
+                    <a:xfrm>
+                      <a:off x="0" y="0"/>
+                      <a:ext cx="5269865" cy="2551430"/>
+                    </a:xfrm>
+                    <a:prstGeom prst="rect">
+                      <a:avLst/>
+                    </a:prstGeom>
+                    <a:noFill/>
+                    <a:ln>
+                      <a:noFill/>
+                    </a:ln>
+                  </pic:spPr>
+                </pic:pic>
+              </a:graphicData>
+            </a:graphic>
+          </wp:inline>
+        </w:drawing>
+      </w:r>
+    </w:p>
+    <w:p>
+      <w:pPr>
+        <w:spacing w:before="120" w:after="120" w:line="288" w:lineRule="auto"/>
+        <w:ind w:left="0"/>
+        <w:jc w:val="left"/>
       </w:pPr>
       <w:r>
         <w:rPr>
@@ -2710,6 +2828,10 @@
         <w:spacing w:before="120" w:after="120" w:line="288" w:lineRule="auto"/>
         <w:ind w:left="0"/>
         <w:jc w:val="left"/>
+        <w:rPr>
+          <w:rFonts w:ascii="Arial" w:hAnsi="Arial" w:eastAsia="等线" w:cs="Arial"/>
+          <w:sz w:val="22"/>
+        </w:rPr>
       </w:pPr>
       <w:r>
         <w:rPr>
@@ -2724,6 +2846,60 @@
         <w:spacing w:before="120" w:after="120" w:line="288" w:lineRule="auto"/>
         <w:ind w:left="0"/>
         <w:jc w:val="left"/>
+        <w:rPr>
+          <w:rFonts w:ascii="Arial" w:hAnsi="Arial" w:eastAsia="等线" w:cs="Arial"/>
+          <w:sz w:val="22"/>
+        </w:rPr>
+      </w:pPr>
+      <w:r>
+        <w:drawing>
+          <wp:inline distT="0" distB="0" distL="114300" distR="114300">
+            <wp:extent cx="5272405" cy="2023110"/>
+            <wp:effectExtent l="0" t="0" r="635" b="3810"/>
+            <wp:docPr id="2" name="图片 1"/>
+            <wp:cNvGraphicFramePr>
+              <a:graphicFrameLocks xmlns:a="http://schemas.openxmlformats.org/drawingml/2006/main" noChangeAspect="1"/>
+            </wp:cNvGraphicFramePr>
+            <a:graphic xmlns:a="http://schemas.openxmlformats.org/drawingml/2006/main">
+              <a:graphicData uri="http://schemas.openxmlformats.org/drawingml/2006/picture">
+                <pic:pic xmlns:pic="http://schemas.openxmlformats.org/drawingml/2006/picture">
+                  <pic:nvPicPr>
+                    <pic:cNvPr id="2" name="图片 1"/>
+                    <pic:cNvPicPr>
+                      <a:picLocks noChangeAspect="1"/>
+                    </pic:cNvPicPr>
+                  </pic:nvPicPr>
+                  <pic:blipFill>
+                    <a:blip r:embed="rId8"/>
+                    <a:stretch>
+                      <a:fillRect/>
+                    </a:stretch>
+                  </pic:blipFill>
+                  <pic:spPr>
+                    <a:xfrm>
+                      <a:off x="0" y="0"/>
+                      <a:ext cx="5272405" cy="2023110"/>
+                    </a:xfrm>
+                    <a:prstGeom prst="rect">
+                      <a:avLst/>
+                    </a:prstGeom>
+                    <a:noFill/>
+                    <a:ln>
+                      <a:noFill/>
+                    </a:ln>
+                  </pic:spPr>
+                </pic:pic>
+              </a:graphicData>
+            </a:graphic>
+          </wp:inline>
+        </w:drawing>
+      </w:r>
+    </w:p>
+    <w:p>
+      <w:pPr>
+        <w:spacing w:before="120" w:after="120" w:line="288" w:lineRule="auto"/>
+        <w:ind w:left="0"/>
+        <w:jc w:val="left"/>
       </w:pPr>
       <w:r>
         <w:rPr>
@@ -2740,8 +2916,8 @@
         <w:jc w:val="left"/>
         <w:outlineLvl w:val="2"/>
       </w:pPr>
-      <w:bookmarkStart w:id="21" w:name="heading_11"/>
-      <w:bookmarkStart w:id="22" w:name="_Toc27990"/>
+      <w:bookmarkStart w:id="21" w:name="_Toc27990"/>
+      <w:bookmarkStart w:id="22" w:name="heading_11"/>
       <w:r>
         <w:rPr>
           <w:rFonts w:ascii="Arial" w:hAnsi="Arial" w:eastAsia="等线" w:cs="Arial"/>
@@ -2772,6 +2948,10 @@
         <w:spacing w:before="120" w:after="120" w:line="288" w:lineRule="auto"/>
         <w:ind w:left="0"/>
         <w:jc w:val="left"/>
+        <w:rPr>
+          <w:rFonts w:ascii="Arial" w:hAnsi="Arial" w:eastAsia="等线" w:cs="Arial"/>
+          <w:sz w:val="22"/>
+        </w:rPr>
       </w:pPr>
       <w:r>
         <w:rPr>
@@ -2786,6 +2966,60 @@
         <w:spacing w:before="120" w:after="120" w:line="288" w:lineRule="auto"/>
         <w:ind w:left="0"/>
         <w:jc w:val="left"/>
+        <w:rPr>
+          <w:rFonts w:ascii="Arial" w:hAnsi="Arial" w:eastAsia="等线" w:cs="Arial"/>
+          <w:sz w:val="22"/>
+        </w:rPr>
+      </w:pPr>
+      <w:r>
+        <w:drawing>
+          <wp:inline distT="0" distB="0" distL="114300" distR="114300">
+            <wp:extent cx="5268595" cy="2675890"/>
+            <wp:effectExtent l="0" t="0" r="4445" b="6350"/>
+            <wp:docPr id="3" name="图片 2"/>
+            <wp:cNvGraphicFramePr>
+              <a:graphicFrameLocks xmlns:a="http://schemas.openxmlformats.org/drawingml/2006/main" noChangeAspect="1"/>
+            </wp:cNvGraphicFramePr>
+            <a:graphic xmlns:a="http://schemas.openxmlformats.org/drawingml/2006/main">
+              <a:graphicData uri="http://schemas.openxmlformats.org/drawingml/2006/picture">
+                <pic:pic xmlns:pic="http://schemas.openxmlformats.org/drawingml/2006/picture">
+                  <pic:nvPicPr>
+                    <pic:cNvPr id="3" name="图片 2"/>
+                    <pic:cNvPicPr>
+                      <a:picLocks noChangeAspect="1"/>
+                    </pic:cNvPicPr>
+                  </pic:nvPicPr>
+                  <pic:blipFill>
+                    <a:blip r:embed="rId9"/>
+                    <a:stretch>
+                      <a:fillRect/>
+                    </a:stretch>
+                  </pic:blipFill>
+                  <pic:spPr>
+                    <a:xfrm>
+                      <a:off x="0" y="0"/>
+                      <a:ext cx="5268595" cy="2675890"/>
+                    </a:xfrm>
+                    <a:prstGeom prst="rect">
+                      <a:avLst/>
+                    </a:prstGeom>
+                    <a:noFill/>
+                    <a:ln>
+                      <a:noFill/>
+                    </a:ln>
+                  </pic:spPr>
+                </pic:pic>
+              </a:graphicData>
+            </a:graphic>
+          </wp:inline>
+        </w:drawing>
+      </w:r>
+    </w:p>
+    <w:p>
+      <w:pPr>
+        <w:spacing w:before="120" w:after="120" w:line="288" w:lineRule="auto"/>
+        <w:ind w:left="0"/>
+        <w:jc w:val="left"/>
       </w:pPr>
       <w:r>
         <w:rPr>
@@ -2800,6 +3034,10 @@
         <w:spacing w:before="120" w:after="120" w:line="288" w:lineRule="auto"/>
         <w:ind w:left="0"/>
         <w:jc w:val="left"/>
+        <w:rPr>
+          <w:rFonts w:ascii="Arial" w:hAnsi="Arial" w:eastAsia="等线" w:cs="Arial"/>
+          <w:sz w:val="22"/>
+        </w:rPr>
       </w:pPr>
       <w:r>
         <w:rPr>
@@ -2807,6 +3045,60 @@
           <w:sz w:val="22"/>
         </w:rPr>
         <w:t>（3）知识模块：如数与代数、图形与几何、数据结构、算法等。</w:t>
+      </w:r>
+    </w:p>
+    <w:p>
+      <w:pPr>
+        <w:spacing w:before="120" w:after="120" w:line="288" w:lineRule="auto"/>
+        <w:ind w:left="0"/>
+        <w:jc w:val="left"/>
+        <w:rPr>
+          <w:rFonts w:ascii="Arial" w:hAnsi="Arial" w:eastAsia="等线" w:cs="Arial"/>
+          <w:sz w:val="22"/>
+        </w:rPr>
+      </w:pPr>
+      <w:r>
+        <w:drawing>
+          <wp:inline distT="0" distB="0" distL="114300" distR="114300">
+            <wp:extent cx="5266055" cy="2713990"/>
+            <wp:effectExtent l="0" t="0" r="6985" b="13970"/>
+            <wp:docPr id="4" name="图片 3"/>
+            <wp:cNvGraphicFramePr>
+              <a:graphicFrameLocks xmlns:a="http://schemas.openxmlformats.org/drawingml/2006/main" noChangeAspect="1"/>
+            </wp:cNvGraphicFramePr>
+            <a:graphic xmlns:a="http://schemas.openxmlformats.org/drawingml/2006/main">
+              <a:graphicData uri="http://schemas.openxmlformats.org/drawingml/2006/picture">
+                <pic:pic xmlns:pic="http://schemas.openxmlformats.org/drawingml/2006/picture">
+                  <pic:nvPicPr>
+                    <pic:cNvPr id="4" name="图片 3"/>
+                    <pic:cNvPicPr>
+                      <a:picLocks noChangeAspect="1"/>
+                    </pic:cNvPicPr>
+                  </pic:nvPicPr>
+                  <pic:blipFill>
+                    <a:blip r:embed="rId10"/>
+                    <a:stretch>
+                      <a:fillRect/>
+                    </a:stretch>
+                  </pic:blipFill>
+                  <pic:spPr>
+                    <a:xfrm>
+                      <a:off x="0" y="0"/>
+                      <a:ext cx="5266055" cy="2713990"/>
+                    </a:xfrm>
+                    <a:prstGeom prst="rect">
+                      <a:avLst/>
+                    </a:prstGeom>
+                    <a:noFill/>
+                    <a:ln>
+                      <a:noFill/>
+                    </a:ln>
+                  </pic:spPr>
+                </pic:pic>
+              </a:graphicData>
+            </a:graphic>
+          </wp:inline>
+        </w:drawing>
       </w:r>
     </w:p>
     <w:p>
@@ -3268,8 +3560,8 @@
         <w:jc w:val="left"/>
         <w:outlineLvl w:val="2"/>
       </w:pPr>
-      <w:bookmarkStart w:id="29" w:name="heading_15"/>
-      <w:bookmarkStart w:id="30" w:name="_Toc110"/>
+      <w:bookmarkStart w:id="29" w:name="_Toc110"/>
+      <w:bookmarkStart w:id="30" w:name="heading_15"/>
       <w:r>
         <w:rPr>
           <w:rFonts w:ascii="Arial" w:hAnsi="Arial" w:eastAsia="等线" w:cs="Arial"/>
@@ -3356,6 +3648,10 @@
         <w:spacing w:before="120" w:after="120" w:line="288" w:lineRule="auto"/>
         <w:ind w:left="0"/>
         <w:jc w:val="left"/>
+        <w:rPr>
+          <w:rFonts w:ascii="Arial" w:hAnsi="Arial" w:eastAsia="等线" w:cs="Arial"/>
+          <w:sz w:val="22"/>
+        </w:rPr>
       </w:pPr>
       <w:r>
         <w:rPr>
@@ -3370,6 +3666,60 @@
         <w:spacing w:before="120" w:after="120" w:line="288" w:lineRule="auto"/>
         <w:ind w:left="0"/>
         <w:jc w:val="left"/>
+        <w:rPr>
+          <w:rFonts w:ascii="Arial" w:hAnsi="Arial" w:eastAsia="等线" w:cs="Arial"/>
+          <w:sz w:val="22"/>
+        </w:rPr>
+      </w:pPr>
+      <w:r>
+        <w:drawing>
+          <wp:inline distT="0" distB="0" distL="114300" distR="114300">
+            <wp:extent cx="5261610" cy="2319020"/>
+            <wp:effectExtent l="0" t="0" r="11430" b="12700"/>
+            <wp:docPr id="6" name="图片 5"/>
+            <wp:cNvGraphicFramePr>
+              <a:graphicFrameLocks xmlns:a="http://schemas.openxmlformats.org/drawingml/2006/main" noChangeAspect="1"/>
+            </wp:cNvGraphicFramePr>
+            <a:graphic xmlns:a="http://schemas.openxmlformats.org/drawingml/2006/main">
+              <a:graphicData uri="http://schemas.openxmlformats.org/drawingml/2006/picture">
+                <pic:pic xmlns:pic="http://schemas.openxmlformats.org/drawingml/2006/picture">
+                  <pic:nvPicPr>
+                    <pic:cNvPr id="6" name="图片 5"/>
+                    <pic:cNvPicPr>
+                      <a:picLocks noChangeAspect="1"/>
+                    </pic:cNvPicPr>
+                  </pic:nvPicPr>
+                  <pic:blipFill>
+                    <a:blip r:embed="rId11"/>
+                    <a:stretch>
+                      <a:fillRect/>
+                    </a:stretch>
+                  </pic:blipFill>
+                  <pic:spPr>
+                    <a:xfrm>
+                      <a:off x="0" y="0"/>
+                      <a:ext cx="5261610" cy="2319020"/>
+                    </a:xfrm>
+                    <a:prstGeom prst="rect">
+                      <a:avLst/>
+                    </a:prstGeom>
+                    <a:noFill/>
+                    <a:ln>
+                      <a:noFill/>
+                    </a:ln>
+                  </pic:spPr>
+                </pic:pic>
+              </a:graphicData>
+            </a:graphic>
+          </wp:inline>
+        </w:drawing>
+      </w:r>
+    </w:p>
+    <w:p>
+      <w:pPr>
+        <w:spacing w:before="120" w:after="120" w:line="288" w:lineRule="auto"/>
+        <w:ind w:left="0"/>
+        <w:jc w:val="left"/>
       </w:pPr>
       <w:r>
         <w:rPr>
@@ -3400,8 +3750,8 @@
         <w:jc w:val="left"/>
         <w:outlineLvl w:val="2"/>
       </w:pPr>
-      <w:bookmarkStart w:id="31" w:name="heading_16"/>
-      <w:bookmarkStart w:id="32" w:name="_Toc22035"/>
+      <w:bookmarkStart w:id="31" w:name="_Toc22035"/>
+      <w:bookmarkStart w:id="32" w:name="heading_16"/>
       <w:r>
         <w:rPr>
           <w:rFonts w:ascii="Arial" w:hAnsi="Arial" w:eastAsia="等线" w:cs="Arial"/>
@@ -3432,6 +3782,10 @@
         <w:spacing w:before="120" w:after="120" w:line="288" w:lineRule="auto"/>
         <w:ind w:left="0"/>
         <w:jc w:val="left"/>
+        <w:rPr>
+          <w:rFonts w:ascii="Arial" w:hAnsi="Arial" w:eastAsia="等线" w:cs="Arial"/>
+          <w:sz w:val="22"/>
+        </w:rPr>
       </w:pPr>
       <w:r>
         <w:rPr>
@@ -3460,6 +3814,10 @@
         <w:spacing w:before="120" w:after="120" w:line="288" w:lineRule="auto"/>
         <w:ind w:left="0"/>
         <w:jc w:val="left"/>
+        <w:rPr>
+          <w:rFonts w:ascii="Arial" w:hAnsi="Arial" w:eastAsia="等线" w:cs="Arial"/>
+          <w:sz w:val="22"/>
+        </w:rPr>
       </w:pPr>
       <w:r>
         <w:rPr>
@@ -3467,6 +3825,60 @@
           <w:sz w:val="22"/>
         </w:rPr>
         <w:t>在个人中心中可查看并修改用户名、邮箱、头像等信息，查看本月打卡记录和当前等级、经验值等。</w:t>
+      </w:r>
+    </w:p>
+    <w:p>
+      <w:pPr>
+        <w:spacing w:before="120" w:after="120" w:line="288" w:lineRule="auto"/>
+        <w:ind w:left="0"/>
+        <w:jc w:val="left"/>
+        <w:rPr>
+          <w:rFonts w:ascii="Arial" w:hAnsi="Arial" w:eastAsia="等线" w:cs="Arial"/>
+          <w:sz w:val="22"/>
+        </w:rPr>
+      </w:pPr>
+      <w:r>
+        <w:drawing>
+          <wp:inline distT="0" distB="0" distL="114300" distR="114300">
+            <wp:extent cx="5263515" cy="2741295"/>
+            <wp:effectExtent l="0" t="0" r="9525" b="1905"/>
+            <wp:docPr id="8" name="图片 2"/>
+            <wp:cNvGraphicFramePr>
+              <a:graphicFrameLocks xmlns:a="http://schemas.openxmlformats.org/drawingml/2006/main" noChangeAspect="1"/>
+            </wp:cNvGraphicFramePr>
+            <a:graphic xmlns:a="http://schemas.openxmlformats.org/drawingml/2006/main">
+              <a:graphicData uri="http://schemas.openxmlformats.org/drawingml/2006/picture">
+                <pic:pic xmlns:pic="http://schemas.openxmlformats.org/drawingml/2006/picture">
+                  <pic:nvPicPr>
+                    <pic:cNvPr id="8" name="图片 2"/>
+                    <pic:cNvPicPr>
+                      <a:picLocks noChangeAspect="1"/>
+                    </pic:cNvPicPr>
+                  </pic:nvPicPr>
+                  <pic:blipFill>
+                    <a:blip r:embed="rId12"/>
+                    <a:stretch>
+                      <a:fillRect/>
+                    </a:stretch>
+                  </pic:blipFill>
+                  <pic:spPr>
+                    <a:xfrm>
+                      <a:off x="0" y="0"/>
+                      <a:ext cx="5263515" cy="2741295"/>
+                    </a:xfrm>
+                    <a:prstGeom prst="rect">
+                      <a:avLst/>
+                    </a:prstGeom>
+                    <a:noFill/>
+                    <a:ln>
+                      <a:noFill/>
+                    </a:ln>
+                  </pic:spPr>
+                </pic:pic>
+              </a:graphicData>
+            </a:graphic>
+          </wp:inline>
+        </w:drawing>
       </w:r>
     </w:p>
     <w:p>
@@ -3580,8 +3992,8 @@
         <w:jc w:val="left"/>
         <w:outlineLvl w:val="1"/>
       </w:pPr>
-      <w:bookmarkStart w:id="35" w:name="heading_18"/>
-      <w:bookmarkStart w:id="36" w:name="_Toc13239"/>
+      <w:bookmarkStart w:id="35" w:name="_Toc13239"/>
+      <w:bookmarkStart w:id="36" w:name="heading_18"/>
       <w:r>
         <w:rPr>
           <w:rFonts w:ascii="Arial" w:hAnsi="Arial" w:eastAsia="等线" w:cs="Arial"/>
@@ -3722,6 +4134,10 @@
         <w:spacing w:before="120" w:after="120" w:line="288" w:lineRule="auto"/>
         <w:ind w:left="0"/>
         <w:jc w:val="left"/>
+        <w:rPr>
+          <w:rFonts w:ascii="Arial" w:hAnsi="Arial" w:eastAsia="等线" w:cs="Arial"/>
+          <w:sz w:val="22"/>
+        </w:rPr>
       </w:pPr>
       <w:r>
         <w:rPr>
@@ -3729,6 +4145,60 @@
           <w:sz w:val="22"/>
         </w:rPr>
         <w:t>雷达图：展示知识点掌握度。</w:t>
+      </w:r>
+    </w:p>
+    <w:p>
+      <w:pPr>
+        <w:spacing w:before="120" w:after="120" w:line="288" w:lineRule="auto"/>
+        <w:ind w:left="0"/>
+        <w:jc w:val="left"/>
+        <w:rPr>
+          <w:rFonts w:ascii="Arial" w:hAnsi="Arial" w:eastAsia="等线" w:cs="Arial"/>
+          <w:sz w:val="22"/>
+        </w:rPr>
+      </w:pPr>
+      <w:r>
+        <w:drawing>
+          <wp:inline distT="0" distB="0" distL="114300" distR="114300">
+            <wp:extent cx="5266055" cy="2303780"/>
+            <wp:effectExtent l="0" t="0" r="6985" b="12700"/>
+            <wp:docPr id="5" name="图片 4"/>
+            <wp:cNvGraphicFramePr>
+              <a:graphicFrameLocks xmlns:a="http://schemas.openxmlformats.org/drawingml/2006/main" noChangeAspect="1"/>
+            </wp:cNvGraphicFramePr>
+            <a:graphic xmlns:a="http://schemas.openxmlformats.org/drawingml/2006/main">
+              <a:graphicData uri="http://schemas.openxmlformats.org/drawingml/2006/picture">
+                <pic:pic xmlns:pic="http://schemas.openxmlformats.org/drawingml/2006/picture">
+                  <pic:nvPicPr>
+                    <pic:cNvPr id="5" name="图片 4"/>
+                    <pic:cNvPicPr>
+                      <a:picLocks noChangeAspect="1"/>
+                    </pic:cNvPicPr>
+                  </pic:nvPicPr>
+                  <pic:blipFill>
+                    <a:blip r:embed="rId13"/>
+                    <a:stretch>
+                      <a:fillRect/>
+                    </a:stretch>
+                  </pic:blipFill>
+                  <pic:spPr>
+                    <a:xfrm>
+                      <a:off x="0" y="0"/>
+                      <a:ext cx="5266055" cy="2303780"/>
+                    </a:xfrm>
+                    <a:prstGeom prst="rect">
+                      <a:avLst/>
+                    </a:prstGeom>
+                    <a:noFill/>
+                    <a:ln>
+                      <a:noFill/>
+                    </a:ln>
+                  </pic:spPr>
+                </pic:pic>
+              </a:graphicData>
+            </a:graphic>
+          </wp:inline>
+        </w:drawing>
       </w:r>
     </w:p>
     <w:p>
@@ -3828,8 +4298,8 @@
         <w:jc w:val="left"/>
         <w:outlineLvl w:val="1"/>
       </w:pPr>
-      <w:bookmarkStart w:id="43" w:name="heading_22"/>
-      <w:bookmarkStart w:id="44" w:name="_Toc29595"/>
+      <w:bookmarkStart w:id="43" w:name="_Toc29595"/>
+      <w:bookmarkStart w:id="44" w:name="heading_22"/>
       <w:r>
         <w:rPr>
           <w:rFonts w:ascii="Arial" w:hAnsi="Arial" w:eastAsia="等线" w:cs="Arial"/>
@@ -3896,8 +4366,8 @@
         <w:jc w:val="left"/>
         <w:outlineLvl w:val="2"/>
       </w:pPr>
-      <w:bookmarkStart w:id="47" w:name="heading_24"/>
-      <w:bookmarkStart w:id="48" w:name="_Toc6877"/>
+      <w:bookmarkStart w:id="47" w:name="_Toc6877"/>
+      <w:bookmarkStart w:id="48" w:name="heading_24"/>
       <w:r>
         <w:rPr>
           <w:rFonts w:ascii="Arial" w:hAnsi="Arial" w:eastAsia="等线" w:cs="Arial"/>
@@ -4186,8 +4656,8 @@
         <w:jc w:val="left"/>
         <w:outlineLvl w:val="2"/>
       </w:pPr>
-      <w:bookmarkStart w:id="55" w:name="heading_28"/>
-      <w:bookmarkStart w:id="56" w:name="_Toc30801"/>
+      <w:bookmarkStart w:id="55" w:name="_Toc30801"/>
+      <w:bookmarkStart w:id="56" w:name="heading_28"/>
       <w:r>
         <w:rPr>
           <w:rFonts w:ascii="Arial" w:hAnsi="Arial" w:eastAsia="等线" w:cs="Arial"/>
@@ -4295,8 +4765,6 @@
         <w:ind w:left="0"/>
         <w:jc w:val="left"/>
       </w:pPr>
-      <w:bookmarkStart w:id="59" w:name="_GoBack"/>
-      <w:bookmarkEnd w:id="59"/>
     </w:p>
     <w:sectPr>
       <w:headerReference r:id="rId3" w:type="default"/>
@@ -4350,9 +4818,9 @@
     <w:lsdException w:unhideWhenUsed="0" w:uiPriority="0" w:semiHidden="0" w:name="index 7"/>
     <w:lsdException w:unhideWhenUsed="0" w:uiPriority="0" w:semiHidden="0" w:name="index 8"/>
     <w:lsdException w:unhideWhenUsed="0" w:uiPriority="0" w:semiHidden="0" w:name="index 9"/>
-    <w:lsdException w:unhideWhenUsed="0" w:uiPriority="0" w:semiHidden="0" w:name="toc 1"/>
-    <w:lsdException w:unhideWhenUsed="0" w:uiPriority="0" w:semiHidden="0" w:name="toc 2"/>
-    <w:lsdException w:unhideWhenUsed="0" w:uiPriority="0" w:semiHidden="0" w:name="toc 3"/>
+    <w:lsdException w:qFormat="1" w:unhideWhenUsed="0" w:uiPriority="0" w:semiHidden="0" w:name="toc 1"/>
+    <w:lsdException w:qFormat="1" w:unhideWhenUsed="0" w:uiPriority="0" w:semiHidden="0" w:name="toc 2"/>
+    <w:lsdException w:qFormat="1" w:unhideWhenUsed="0" w:uiPriority="0" w:semiHidden="0" w:name="toc 3"/>
     <w:lsdException w:unhideWhenUsed="0" w:uiPriority="0" w:semiHidden="0" w:name="toc 4"/>
     <w:lsdException w:unhideWhenUsed="0" w:uiPriority="0" w:semiHidden="0" w:name="toc 5"/>
     <w:lsdException w:unhideWhenUsed="0" w:uiPriority="0" w:semiHidden="0" w:name="toc 6"/>
@@ -4396,7 +4864,7 @@
     <w:lsdException w:qFormat="1" w:unhideWhenUsed="0" w:uiPriority="0" w:semiHidden="0" w:name="Title"/>
     <w:lsdException w:unhideWhenUsed="0" w:uiPriority="0" w:semiHidden="0" w:name="Closing"/>
     <w:lsdException w:unhideWhenUsed="0" w:uiPriority="0" w:semiHidden="0" w:name="Signature"/>
-    <w:lsdException w:unhideWhenUsed="0" w:uiPriority="0" w:name="Default Paragraph Font"/>
+    <w:lsdException w:qFormat="1" w:unhideWhenUsed="0" w:uiPriority="0" w:name="Default Paragraph Font"/>
     <w:lsdException w:unhideWhenUsed="0" w:uiPriority="0" w:semiHidden="0" w:name="Body Text"/>
     <w:lsdException w:unhideWhenUsed="0" w:uiPriority="0" w:semiHidden="0" w:name="Body Text Indent"/>
     <w:lsdException w:unhideWhenUsed="0" w:uiPriority="0" w:semiHidden="0" w:name="List Continue"/>
@@ -4434,7 +4902,7 @@
     <w:lsdException w:unhideWhenUsed="0" w:uiPriority="0" w:semiHidden="0" w:name="HTML Sample"/>
     <w:lsdException w:unhideWhenUsed="0" w:uiPriority="0" w:semiHidden="0" w:name="HTML Typewriter"/>
     <w:lsdException w:unhideWhenUsed="0" w:uiPriority="0" w:semiHidden="0" w:name="HTML Variable"/>
-    <w:lsdException w:unhideWhenUsed="0" w:uiPriority="0" w:name="Normal Table"/>
+    <w:lsdException w:qFormat="1" w:unhideWhenUsed="0" w:uiPriority="0" w:name="Normal Table"/>
     <w:lsdException w:unhideWhenUsed="0" w:uiPriority="0" w:semiHidden="0" w:name="annotation subject"/>
     <w:lsdException w:unhideWhenUsed="0" w:uiPriority="0" w:semiHidden="0" w:name="Table Simple 1"/>
     <w:lsdException w:unhideWhenUsed="0" w:uiPriority="0" w:semiHidden="0" w:name="Table Simple 2"/>
@@ -4589,6 +5057,7 @@
       <w:jc w:val="both"/>
     </w:pPr>
     <w:rPr>
+      <w:rFonts w:asciiTheme="minorHAnsi" w:hAnsiTheme="minorHAnsi" w:eastAsiaTheme="minorEastAsia" w:cstheme="minorBidi"/>
       <w:sz w:val="21"/>
       <w:szCs w:val="22"/>
     </w:rPr>
@@ -4596,11 +5065,13 @@
   <w:style w:type="character" w:default="1" w:styleId="6">
     <w:name w:val="Default Paragraph Font"/>
     <w:semiHidden/>
+    <w:qFormat/>
     <w:uiPriority w:val="0"/>
   </w:style>
   <w:style w:type="table" w:default="1" w:styleId="5">
     <w:name w:val="Normal Table"/>
     <w:semiHidden/>
+    <w:qFormat/>
     <w:uiPriority w:val="0"/>
     <w:tblPr>
       <w:tblCellMar>
@@ -4615,6 +5086,7 @@
     <w:name w:val="toc 3"/>
     <w:basedOn w:val="1"/>
     <w:next w:val="1"/>
+    <w:qFormat/>
     <w:uiPriority w:val="0"/>
     <w:pPr>
       <w:ind w:left="840" w:leftChars="400"/>
@@ -4624,12 +5096,14 @@
     <w:name w:val="toc 1"/>
     <w:basedOn w:val="1"/>
     <w:next w:val="1"/>
+    <w:qFormat/>
     <w:uiPriority w:val="0"/>
   </w:style>
   <w:style w:type="paragraph" w:styleId="4">
     <w:name w:val="toc 2"/>
     <w:basedOn w:val="1"/>
     <w:next w:val="1"/>
+    <w:qFormat/>
     <w:uiPriority w:val="0"/>
     <w:pPr>
       <w:ind w:left="420" w:leftChars="200"/>

</xml_diff>